<commit_message>
Update ZeberFrontend and details.docx with latest versions
</commit_message>
<xml_diff>
--- a/details.docx
+++ b/details.docx
@@ -10,7 +10,6 @@
           <w:szCs w:val="44"/>
         </w:rPr>
       </w:pPr>
-      <w:proofErr w:type="spellStart"/>
       <w:r>
         <w:rPr>
           <w:rFonts w:ascii="Times New Roman" w:hAnsi="Times New Roman" w:cs="Times New Roman"/>
@@ -19,51 +18,22 @@
         </w:rPr>
         <w:t>ZeberFrontend</w:t>
       </w:r>
-      <w:proofErr w:type="spellEnd"/>
-    </w:p>
-    <w:p>
-      <w:pPr>
-        <w:rPr>
-          <w:rFonts w:ascii="Times New Roman" w:hAnsi="Times New Roman" w:cs="Times New Roman"/>
-          <w:sz w:val="24"/>
-          <w:szCs w:val="24"/>
-        </w:rPr>
-      </w:pPr>
-      <w:proofErr w:type="spellStart"/>
-      <w:r>
-        <w:rPr>
-          <w:rFonts w:ascii="Times New Roman" w:hAnsi="Times New Roman" w:cs="Times New Roman"/>
-          <w:sz w:val="24"/>
-          <w:szCs w:val="24"/>
-        </w:rPr>
-        <w:t>Src</w:t>
-      </w:r>
-      <w:proofErr w:type="spellEnd"/>
-      <w:r>
-        <w:rPr>
-          <w:rFonts w:ascii="Times New Roman" w:hAnsi="Times New Roman" w:cs="Times New Roman"/>
-          <w:sz w:val="24"/>
-          <w:szCs w:val="24"/>
-        </w:rPr>
-        <w:t>/</w:t>
-      </w:r>
-      <w:proofErr w:type="spellStart"/>
-      <w:r>
-        <w:rPr>
-          <w:rFonts w:ascii="Times New Roman" w:hAnsi="Times New Roman" w:cs="Times New Roman"/>
-          <w:sz w:val="24"/>
-          <w:szCs w:val="24"/>
-        </w:rPr>
-        <w:t>AllFolders</w:t>
-      </w:r>
-      <w:proofErr w:type="spellEnd"/>
-      <w:r>
-        <w:rPr>
-          <w:rFonts w:ascii="Times New Roman" w:hAnsi="Times New Roman" w:cs="Times New Roman"/>
-          <w:sz w:val="24"/>
-          <w:szCs w:val="24"/>
-        </w:rPr>
-        <w:t>/</w:t>
+    </w:p>
+    <w:p>
+      <w:pPr>
+        <w:rPr>
+          <w:rFonts w:ascii="Times New Roman" w:hAnsi="Times New Roman" w:cs="Times New Roman"/>
+          <w:sz w:val="24"/>
+          <w:szCs w:val="24"/>
+        </w:rPr>
+      </w:pPr>
+      <w:r>
+        <w:rPr>
+          <w:rFonts w:ascii="Times New Roman" w:hAnsi="Times New Roman" w:cs="Times New Roman"/>
+          <w:sz w:val="24"/>
+          <w:szCs w:val="24"/>
+        </w:rPr>
+        <w:t>Src/AllFolders/</w:t>
       </w:r>
     </w:p>
     <w:p>
@@ -123,41 +93,13 @@
           <w:szCs w:val="24"/>
         </w:rPr>
       </w:pPr>
-      <w:proofErr w:type="spellStart"/>
-      <w:r>
-        <w:rPr>
-          <w:rFonts w:ascii="Times New Roman" w:hAnsi="Times New Roman" w:cs="Times New Roman"/>
-          <w:sz w:val="24"/>
-          <w:szCs w:val="24"/>
-        </w:rPr>
-        <w:t>AudioBookPlayer</w:t>
-      </w:r>
-      <w:proofErr w:type="spellEnd"/>
-      <w:r>
-        <w:rPr>
-          <w:rFonts w:ascii="Times New Roman" w:hAnsi="Times New Roman" w:cs="Times New Roman"/>
-          <w:sz w:val="24"/>
-          <w:szCs w:val="24"/>
-        </w:rPr>
-        <w:t xml:space="preserve"> </w:t>
-      </w:r>
-      <w:proofErr w:type="gramStart"/>
-      <w:r>
-        <w:rPr>
-          <w:rFonts w:ascii="Times New Roman" w:hAnsi="Times New Roman" w:cs="Times New Roman"/>
-          <w:sz w:val="24"/>
-          <w:szCs w:val="24"/>
-        </w:rPr>
-        <w:t>–“</w:t>
-      </w:r>
-      <w:proofErr w:type="gramEnd"/>
-      <w:r>
-        <w:rPr>
-          <w:rFonts w:ascii="Times New Roman" w:hAnsi="Times New Roman" w:cs="Times New Roman"/>
-          <w:sz w:val="24"/>
-          <w:szCs w:val="24"/>
-        </w:rPr>
-        <w:t>/audio-book”</w:t>
+      <w:r>
+        <w:rPr>
+          <w:rFonts w:ascii="Times New Roman" w:hAnsi="Times New Roman" w:cs="Times New Roman"/>
+          <w:sz w:val="24"/>
+          <w:szCs w:val="24"/>
+        </w:rPr>
+        <w:t>AudioBookPlayer –“/audio-book”</w:t>
       </w:r>
     </w:p>
     <w:p>
@@ -201,25 +143,7 @@
           <w:sz w:val="24"/>
           <w:szCs w:val="24"/>
         </w:rPr>
-        <w:t xml:space="preserve">Book </w:t>
-      </w:r>
-      <w:proofErr w:type="gramStart"/>
-      <w:r>
-        <w:rPr>
-          <w:rFonts w:ascii="Times New Roman" w:hAnsi="Times New Roman" w:cs="Times New Roman"/>
-          <w:sz w:val="24"/>
-          <w:szCs w:val="24"/>
-        </w:rPr>
-        <w:t>–“</w:t>
-      </w:r>
-      <w:proofErr w:type="gramEnd"/>
-      <w:r>
-        <w:rPr>
-          <w:rFonts w:ascii="Times New Roman" w:hAnsi="Times New Roman" w:cs="Times New Roman"/>
-          <w:sz w:val="24"/>
-          <w:szCs w:val="24"/>
-        </w:rPr>
-        <w:t>/book”</w:t>
+        <w:t>Book –“/book”</w:t>
       </w:r>
     </w:p>
     <w:p>
@@ -235,23 +159,13 @@
           <w:szCs w:val="24"/>
         </w:rPr>
       </w:pPr>
-      <w:proofErr w:type="spellStart"/>
-      <w:r>
-        <w:rPr>
-          <w:rFonts w:ascii="Times New Roman" w:hAnsi="Times New Roman" w:cs="Times New Roman"/>
-          <w:sz w:val="24"/>
-          <w:szCs w:val="24"/>
-        </w:rPr>
-        <w:t>UploadBook</w:t>
-      </w:r>
-      <w:proofErr w:type="spellEnd"/>
-      <w:r>
-        <w:rPr>
-          <w:rFonts w:ascii="Times New Roman" w:hAnsi="Times New Roman" w:cs="Times New Roman"/>
-          <w:sz w:val="24"/>
-          <w:szCs w:val="24"/>
-        </w:rPr>
-        <w:t xml:space="preserve"> – “/upload-book”</w:t>
+      <w:r>
+        <w:rPr>
+          <w:rFonts w:ascii="Times New Roman" w:hAnsi="Times New Roman" w:cs="Times New Roman"/>
+          <w:sz w:val="24"/>
+          <w:szCs w:val="24"/>
+        </w:rPr>
+        <w:t>UploadBook – “/upload-book”</w:t>
       </w:r>
     </w:p>
     <w:p>
@@ -311,41 +225,13 @@
           <w:szCs w:val="24"/>
         </w:rPr>
       </w:pPr>
-      <w:proofErr w:type="spellStart"/>
-      <w:r>
-        <w:rPr>
-          <w:rFonts w:ascii="Times New Roman" w:hAnsi="Times New Roman" w:cs="Times New Roman"/>
-          <w:sz w:val="24"/>
-          <w:szCs w:val="24"/>
-        </w:rPr>
-        <w:t>BuySell</w:t>
-      </w:r>
-      <w:proofErr w:type="spellEnd"/>
-      <w:r>
-        <w:rPr>
-          <w:rFonts w:ascii="Times New Roman" w:hAnsi="Times New Roman" w:cs="Times New Roman"/>
-          <w:sz w:val="24"/>
-          <w:szCs w:val="24"/>
-        </w:rPr>
-        <w:t xml:space="preserve"> – (</w:t>
-      </w:r>
-      <w:proofErr w:type="spellStart"/>
-      <w:r>
-        <w:rPr>
-          <w:rFonts w:ascii="Times New Roman" w:hAnsi="Times New Roman" w:cs="Times New Roman"/>
-          <w:sz w:val="24"/>
-          <w:szCs w:val="24"/>
-        </w:rPr>
-        <w:t>BuySellRoutes</w:t>
-      </w:r>
-      <w:proofErr w:type="spellEnd"/>
-      <w:r>
-        <w:rPr>
-          <w:rFonts w:ascii="Times New Roman" w:hAnsi="Times New Roman" w:cs="Times New Roman"/>
-          <w:sz w:val="24"/>
-          <w:szCs w:val="24"/>
-        </w:rPr>
-        <w:t xml:space="preserve"> --“/*”)</w:t>
+      <w:r>
+        <w:rPr>
+          <w:rFonts w:ascii="Times New Roman" w:hAnsi="Times New Roman" w:cs="Times New Roman"/>
+          <w:sz w:val="24"/>
+          <w:szCs w:val="24"/>
+        </w:rPr>
+        <w:t>BuySell – (BuySellRoutes --“/*”)</w:t>
       </w:r>
     </w:p>
     <w:p>
@@ -367,36 +253,24 @@
           <w:sz w:val="24"/>
           <w:szCs w:val="24"/>
         </w:rPr>
-        <w:t>/</w:t>
-      </w:r>
-      <w:proofErr w:type="gramStart"/>
-      <w:r>
-        <w:rPr>
-          <w:rFonts w:ascii="Times New Roman" w:hAnsi="Times New Roman" w:cs="Times New Roman"/>
-          <w:sz w:val="24"/>
-          <w:szCs w:val="24"/>
-        </w:rPr>
-        <w:t>book</w:t>
-      </w:r>
-      <w:proofErr w:type="gramEnd"/>
-      <w:r>
-        <w:rPr>
-          <w:rFonts w:ascii="Times New Roman" w:hAnsi="Times New Roman" w:cs="Times New Roman"/>
-          <w:sz w:val="24"/>
-          <w:szCs w:val="24"/>
-        </w:rPr>
-        <w:t xml:space="preserve">-sell – </w:t>
-      </w:r>
-      <w:proofErr w:type="spellStart"/>
-      <w:r>
-        <w:rPr>
-          <w:rFonts w:ascii="Times New Roman" w:hAnsi="Times New Roman" w:cs="Times New Roman"/>
-          <w:sz w:val="24"/>
-          <w:szCs w:val="24"/>
-        </w:rPr>
-        <w:t>HomeScreen</w:t>
-      </w:r>
-      <w:proofErr w:type="spellEnd"/>
+        <w:t>/b</w:t>
+      </w:r>
+      <w:r>
+        <w:rPr>
+          <w:rFonts w:ascii="Times New Roman" w:hAnsi="Times New Roman" w:cs="Times New Roman"/>
+          <w:sz w:val="24"/>
+          <w:szCs w:val="24"/>
+        </w:rPr>
+        <w:t>uy</w:t>
+      </w:r>
+      <w:r>
+        <w:rPr>
+          <w:rFonts w:ascii="Times New Roman" w:hAnsi="Times New Roman" w:cs="Times New Roman"/>
+          <w:sz w:val="24"/>
+          <w:szCs w:val="24"/>
+        </w:rPr>
+        <w:t>-sell – HomeScreen</w:t>
+      </w:r>
     </w:p>
     <w:p>
       <w:pPr>
@@ -417,25 +291,7 @@
           <w:sz w:val="24"/>
           <w:szCs w:val="24"/>
         </w:rPr>
-        <w:t>/</w:t>
-      </w:r>
-      <w:proofErr w:type="gramStart"/>
-      <w:r>
-        <w:rPr>
-          <w:rFonts w:ascii="Times New Roman" w:hAnsi="Times New Roman" w:cs="Times New Roman"/>
-          <w:sz w:val="24"/>
-          <w:szCs w:val="24"/>
-        </w:rPr>
-        <w:t>sell</w:t>
-      </w:r>
-      <w:proofErr w:type="gramEnd"/>
-      <w:r>
-        <w:rPr>
-          <w:rFonts w:ascii="Times New Roman" w:hAnsi="Times New Roman" w:cs="Times New Roman"/>
-          <w:sz w:val="24"/>
-          <w:szCs w:val="24"/>
-        </w:rPr>
-        <w:t xml:space="preserve"> – Sell</w:t>
+        <w:t>/sell – Sell</w:t>
       </w:r>
     </w:p>
     <w:p>
@@ -457,25 +313,7 @@
           <w:sz w:val="24"/>
           <w:szCs w:val="24"/>
         </w:rPr>
-        <w:t>/</w:t>
-      </w:r>
-      <w:proofErr w:type="gramStart"/>
-      <w:r>
-        <w:rPr>
-          <w:rFonts w:ascii="Times New Roman" w:hAnsi="Times New Roman" w:cs="Times New Roman"/>
-          <w:sz w:val="24"/>
-          <w:szCs w:val="24"/>
-        </w:rPr>
-        <w:t>cart</w:t>
-      </w:r>
-      <w:proofErr w:type="gramEnd"/>
-      <w:r>
-        <w:rPr>
-          <w:rFonts w:ascii="Times New Roman" w:hAnsi="Times New Roman" w:cs="Times New Roman"/>
-          <w:sz w:val="24"/>
-          <w:szCs w:val="24"/>
-        </w:rPr>
-        <w:t xml:space="preserve"> – Cart</w:t>
+        <w:t>/cart – Cart</w:t>
       </w:r>
     </w:p>
     <w:p>
@@ -491,52 +329,14 @@
           <w:szCs w:val="24"/>
         </w:rPr>
       </w:pPr>
-      <w:proofErr w:type="gramStart"/>
-      <w:r>
-        <w:rPr>
-          <w:rFonts w:ascii="Times New Roman" w:hAnsi="Times New Roman" w:cs="Times New Roman"/>
-          <w:sz w:val="24"/>
-          <w:szCs w:val="24"/>
-        </w:rPr>
-        <w:t>/:</w:t>
-      </w:r>
-      <w:proofErr w:type="spellStart"/>
-      <w:r>
-        <w:rPr>
-          <w:rFonts w:ascii="Times New Roman" w:hAnsi="Times New Roman" w:cs="Times New Roman"/>
-          <w:sz w:val="24"/>
-          <w:szCs w:val="24"/>
-        </w:rPr>
-        <w:t>apiType</w:t>
-      </w:r>
-      <w:proofErr w:type="spellEnd"/>
-      <w:proofErr w:type="gramEnd"/>
-      <w:r>
-        <w:rPr>
-          <w:rFonts w:ascii="Times New Roman" w:hAnsi="Times New Roman" w:cs="Times New Roman"/>
-          <w:sz w:val="24"/>
-          <w:szCs w:val="24"/>
-        </w:rPr>
-        <w:t>/book/:id</w:t>
-      </w:r>
-      <w:r>
-        <w:rPr>
-          <w:rFonts w:ascii="Times New Roman" w:hAnsi="Times New Roman" w:cs="Times New Roman"/>
-          <w:sz w:val="24"/>
-          <w:szCs w:val="24"/>
-        </w:rPr>
-        <w:t xml:space="preserve"> – </w:t>
-      </w:r>
-      <w:proofErr w:type="spellStart"/>
-      <w:r>
-        <w:rPr>
-          <w:rFonts w:ascii="Times New Roman" w:hAnsi="Times New Roman" w:cs="Times New Roman"/>
-          <w:sz w:val="24"/>
-          <w:szCs w:val="24"/>
-        </w:rPr>
-        <w:t>BookLayout</w:t>
-      </w:r>
-      <w:proofErr w:type="spellEnd"/>
+      <w:r>
+        <w:rPr>
+          <w:rFonts w:ascii="Times New Roman" w:hAnsi="Times New Roman" w:cs="Times New Roman"/>
+          <w:sz w:val="24"/>
+          <w:szCs w:val="24"/>
+        </w:rPr>
+        <w:t>/:apiType/book/:id – BookLayout</w:t>
+      </w:r>
     </w:p>
     <w:p>
       <w:pPr>
@@ -560,41 +360,13 @@
           <w:szCs w:val="24"/>
         </w:rPr>
       </w:pPr>
-      <w:proofErr w:type="spellStart"/>
-      <w:r>
-        <w:rPr>
-          <w:rFonts w:ascii="Times New Roman" w:hAnsi="Times New Roman" w:cs="Times New Roman"/>
-          <w:sz w:val="24"/>
-          <w:szCs w:val="24"/>
-        </w:rPr>
-        <w:t>MyProfilePage</w:t>
-      </w:r>
-      <w:proofErr w:type="spellEnd"/>
-      <w:r>
-        <w:rPr>
-          <w:rFonts w:ascii="Times New Roman" w:hAnsi="Times New Roman" w:cs="Times New Roman"/>
-          <w:sz w:val="24"/>
-          <w:szCs w:val="24"/>
-        </w:rPr>
-        <w:t xml:space="preserve"> – (</w:t>
-      </w:r>
-      <w:proofErr w:type="spellStart"/>
-      <w:r>
-        <w:rPr>
-          <w:rFonts w:ascii="Times New Roman" w:hAnsi="Times New Roman" w:cs="Times New Roman"/>
-          <w:sz w:val="24"/>
-          <w:szCs w:val="24"/>
-        </w:rPr>
-        <w:t>LibraryProfilePage</w:t>
-      </w:r>
-      <w:proofErr w:type="spellEnd"/>
-      <w:r>
-        <w:rPr>
-          <w:rFonts w:ascii="Times New Roman" w:hAnsi="Times New Roman" w:cs="Times New Roman"/>
-          <w:sz w:val="24"/>
-          <w:szCs w:val="24"/>
-        </w:rPr>
-        <w:t xml:space="preserve"> – “/library-profile/*”)</w:t>
+      <w:r>
+        <w:rPr>
+          <w:rFonts w:ascii="Times New Roman" w:hAnsi="Times New Roman" w:cs="Times New Roman"/>
+          <w:sz w:val="24"/>
+          <w:szCs w:val="24"/>
+        </w:rPr>
+        <w:t>MyProfilePage – (LibraryProfilePage – “/library-profile/*”)</w:t>
       </w:r>
     </w:p>
     <w:p>
@@ -616,52 +388,16 @@
           <w:sz w:val="24"/>
           <w:szCs w:val="24"/>
         </w:rPr>
-        <w:t>/</w:t>
-      </w:r>
-      <w:proofErr w:type="gramStart"/>
-      <w:r>
-        <w:rPr>
-          <w:rFonts w:ascii="Times New Roman" w:hAnsi="Times New Roman" w:cs="Times New Roman"/>
-          <w:sz w:val="24"/>
-          <w:szCs w:val="24"/>
-        </w:rPr>
-        <w:t>library</w:t>
-      </w:r>
-      <w:proofErr w:type="gramEnd"/>
-      <w:r>
-        <w:rPr>
-          <w:rFonts w:ascii="Times New Roman" w:hAnsi="Times New Roman" w:cs="Times New Roman"/>
-          <w:sz w:val="24"/>
-          <w:szCs w:val="24"/>
-        </w:rPr>
-        <w:t>-profile</w:t>
-      </w:r>
-      <w:r>
-        <w:rPr>
-          <w:rFonts w:ascii="Times New Roman" w:hAnsi="Times New Roman" w:cs="Times New Roman"/>
-          <w:sz w:val="24"/>
-          <w:szCs w:val="24"/>
-        </w:rPr>
-        <w:t xml:space="preserve"> </w:t>
-      </w:r>
-      <w:r>
-        <w:rPr>
-          <w:rFonts w:ascii="Times New Roman" w:hAnsi="Times New Roman" w:cs="Times New Roman"/>
-          <w:sz w:val="24"/>
-          <w:szCs w:val="24"/>
-        </w:rPr>
-        <w:t xml:space="preserve">/ - </w:t>
-      </w:r>
-      <w:proofErr w:type="spellStart"/>
-      <w:r>
-        <w:rPr>
-          <w:rFonts w:ascii="Times New Roman" w:hAnsi="Times New Roman" w:cs="Times New Roman"/>
-          <w:sz w:val="24"/>
-          <w:szCs w:val="24"/>
-        </w:rPr>
-        <w:t>UserProfileDisplay</w:t>
-      </w:r>
-      <w:proofErr w:type="spellEnd"/>
+        <w:t xml:space="preserve">/library-profile </w:t>
+      </w:r>
+      <w:r>
+        <w:rPr>
+          <w:rFonts w:ascii="Times New Roman" w:hAnsi="Times New Roman" w:cs="Times New Roman"/>
+          <w:sz w:val="24"/>
+          <w:szCs w:val="24"/>
+        </w:rPr>
+        <w:t>/ - UserProfileDisplay</w:t>
+      </w:r>
     </w:p>
     <w:p>
       <w:pPr>
@@ -682,33 +418,7 @@
           <w:sz w:val="24"/>
           <w:szCs w:val="24"/>
         </w:rPr>
-        <w:t>/</w:t>
-      </w:r>
-      <w:proofErr w:type="gramStart"/>
-      <w:r>
-        <w:rPr>
-          <w:rFonts w:ascii="Times New Roman" w:hAnsi="Times New Roman" w:cs="Times New Roman"/>
-          <w:sz w:val="24"/>
-          <w:szCs w:val="24"/>
-        </w:rPr>
-        <w:t>library</w:t>
-      </w:r>
-      <w:proofErr w:type="gramEnd"/>
-      <w:r>
-        <w:rPr>
-          <w:rFonts w:ascii="Times New Roman" w:hAnsi="Times New Roman" w:cs="Times New Roman"/>
-          <w:sz w:val="24"/>
-          <w:szCs w:val="24"/>
-        </w:rPr>
-        <w:t>-profile</w:t>
-      </w:r>
-      <w:r>
-        <w:rPr>
-          <w:rFonts w:ascii="Times New Roman" w:hAnsi="Times New Roman" w:cs="Times New Roman"/>
-          <w:sz w:val="24"/>
-          <w:szCs w:val="24"/>
-        </w:rPr>
-        <w:t xml:space="preserve"> </w:t>
+        <w:t xml:space="preserve">/library-profile </w:t>
       </w:r>
       <w:r>
         <w:rPr>
@@ -738,33 +448,7 @@
           <w:sz w:val="24"/>
           <w:szCs w:val="24"/>
         </w:rPr>
-        <w:t>/</w:t>
-      </w:r>
-      <w:proofErr w:type="gramStart"/>
-      <w:r>
-        <w:rPr>
-          <w:rFonts w:ascii="Times New Roman" w:hAnsi="Times New Roman" w:cs="Times New Roman"/>
-          <w:sz w:val="24"/>
-          <w:szCs w:val="24"/>
-        </w:rPr>
-        <w:t>library</w:t>
-      </w:r>
-      <w:proofErr w:type="gramEnd"/>
-      <w:r>
-        <w:rPr>
-          <w:rFonts w:ascii="Times New Roman" w:hAnsi="Times New Roman" w:cs="Times New Roman"/>
-          <w:sz w:val="24"/>
-          <w:szCs w:val="24"/>
-        </w:rPr>
-        <w:t>-profile</w:t>
-      </w:r>
-      <w:r>
-        <w:rPr>
-          <w:rFonts w:ascii="Times New Roman" w:hAnsi="Times New Roman" w:cs="Times New Roman"/>
-          <w:sz w:val="24"/>
-          <w:szCs w:val="24"/>
-        </w:rPr>
-        <w:t xml:space="preserve"> </w:t>
+        <w:t xml:space="preserve">/library-profile </w:t>
       </w:r>
       <w:r>
         <w:rPr>
@@ -794,33 +478,7 @@
           <w:sz w:val="24"/>
           <w:szCs w:val="24"/>
         </w:rPr>
-        <w:t>/</w:t>
-      </w:r>
-      <w:proofErr w:type="gramStart"/>
-      <w:r>
-        <w:rPr>
-          <w:rFonts w:ascii="Times New Roman" w:hAnsi="Times New Roman" w:cs="Times New Roman"/>
-          <w:sz w:val="24"/>
-          <w:szCs w:val="24"/>
-        </w:rPr>
-        <w:t>library</w:t>
-      </w:r>
-      <w:proofErr w:type="gramEnd"/>
-      <w:r>
-        <w:rPr>
-          <w:rFonts w:ascii="Times New Roman" w:hAnsi="Times New Roman" w:cs="Times New Roman"/>
-          <w:sz w:val="24"/>
-          <w:szCs w:val="24"/>
-        </w:rPr>
-        <w:t>-profile</w:t>
-      </w:r>
-      <w:r>
-        <w:rPr>
-          <w:rFonts w:ascii="Times New Roman" w:hAnsi="Times New Roman" w:cs="Times New Roman"/>
-          <w:sz w:val="24"/>
-          <w:szCs w:val="24"/>
-        </w:rPr>
-        <w:t xml:space="preserve"> </w:t>
+        <w:t xml:space="preserve">/library-profile </w:t>
       </w:r>
       <w:r>
         <w:rPr>
@@ -850,59 +508,15 @@
           <w:sz w:val="24"/>
           <w:szCs w:val="24"/>
         </w:rPr>
-        <w:t>/</w:t>
-      </w:r>
-      <w:proofErr w:type="gramStart"/>
-      <w:r>
-        <w:rPr>
-          <w:rFonts w:ascii="Times New Roman" w:hAnsi="Times New Roman" w:cs="Times New Roman"/>
-          <w:sz w:val="24"/>
-          <w:szCs w:val="24"/>
-        </w:rPr>
-        <w:t>library</w:t>
-      </w:r>
-      <w:proofErr w:type="gramEnd"/>
-      <w:r>
-        <w:rPr>
-          <w:rFonts w:ascii="Times New Roman" w:hAnsi="Times New Roman" w:cs="Times New Roman"/>
-          <w:sz w:val="24"/>
-          <w:szCs w:val="24"/>
-        </w:rPr>
-        <w:t>-profile</w:t>
-      </w:r>
-      <w:r>
-        <w:rPr>
-          <w:rFonts w:ascii="Times New Roman" w:hAnsi="Times New Roman" w:cs="Times New Roman"/>
-          <w:sz w:val="24"/>
-          <w:szCs w:val="24"/>
-        </w:rPr>
-        <w:t xml:space="preserve"> </w:t>
-      </w:r>
-      <w:r>
-        <w:rPr>
-          <w:rFonts w:ascii="Times New Roman" w:hAnsi="Times New Roman" w:cs="Times New Roman"/>
-          <w:sz w:val="24"/>
-          <w:szCs w:val="24"/>
-        </w:rPr>
-        <w:t>/</w:t>
-      </w:r>
-      <w:proofErr w:type="spellStart"/>
-      <w:r>
-        <w:rPr>
-          <w:rFonts w:ascii="Times New Roman" w:hAnsi="Times New Roman" w:cs="Times New Roman"/>
-          <w:sz w:val="24"/>
-          <w:szCs w:val="24"/>
-        </w:rPr>
-        <w:t>myorders</w:t>
-      </w:r>
-      <w:proofErr w:type="spellEnd"/>
-      <w:r>
-        <w:rPr>
-          <w:rFonts w:ascii="Times New Roman" w:hAnsi="Times New Roman" w:cs="Times New Roman"/>
-          <w:sz w:val="24"/>
-          <w:szCs w:val="24"/>
-        </w:rPr>
-        <w:t xml:space="preserve"> – MyOrder</w:t>
+        <w:t xml:space="preserve">/library-profile </w:t>
+      </w:r>
+      <w:r>
+        <w:rPr>
+          <w:rFonts w:ascii="Times New Roman" w:hAnsi="Times New Roman" w:cs="Times New Roman"/>
+          <w:sz w:val="24"/>
+          <w:szCs w:val="24"/>
+        </w:rPr>
+        <w:t>/myorders – MyOrder</w:t>
       </w:r>
     </w:p>
     <w:p>
@@ -924,44 +538,8 @@
           <w:sz w:val="24"/>
           <w:szCs w:val="24"/>
         </w:rPr>
-        <w:t>/</w:t>
-      </w:r>
-      <w:proofErr w:type="gramStart"/>
-      <w:r>
-        <w:rPr>
-          <w:rFonts w:ascii="Times New Roman" w:hAnsi="Times New Roman" w:cs="Times New Roman"/>
-          <w:sz w:val="24"/>
-          <w:szCs w:val="24"/>
-        </w:rPr>
-        <w:t>library</w:t>
-      </w:r>
-      <w:proofErr w:type="gramEnd"/>
-      <w:r>
-        <w:rPr>
-          <w:rFonts w:ascii="Times New Roman" w:hAnsi="Times New Roman" w:cs="Times New Roman"/>
-          <w:sz w:val="24"/>
-          <w:szCs w:val="24"/>
-        </w:rPr>
-        <w:t>-profile</w:t>
-      </w:r>
-      <w:r>
-        <w:rPr>
-          <w:rFonts w:ascii="Times New Roman" w:hAnsi="Times New Roman" w:cs="Times New Roman"/>
-          <w:sz w:val="24"/>
-          <w:szCs w:val="24"/>
-        </w:rPr>
-        <w:t xml:space="preserve"> /edit-profile – </w:t>
-      </w:r>
-      <w:proofErr w:type="spellStart"/>
-      <w:r>
-        <w:rPr>
-          <w:rFonts w:ascii="Times New Roman" w:hAnsi="Times New Roman" w:cs="Times New Roman"/>
-          <w:sz w:val="24"/>
-          <w:szCs w:val="24"/>
-        </w:rPr>
-        <w:t>EditProfile</w:t>
-      </w:r>
-      <w:proofErr w:type="spellEnd"/>
+        <w:t>/library-profile /edit-profile – EditProfile</w:t>
+      </w:r>
     </w:p>
     <w:p>
       <w:pPr>
@@ -982,62 +560,8 @@
           <w:sz w:val="24"/>
           <w:szCs w:val="24"/>
         </w:rPr>
-        <w:t>/</w:t>
-      </w:r>
-      <w:proofErr w:type="gramStart"/>
-      <w:r>
-        <w:rPr>
-          <w:rFonts w:ascii="Times New Roman" w:hAnsi="Times New Roman" w:cs="Times New Roman"/>
-          <w:sz w:val="24"/>
-          <w:szCs w:val="24"/>
-        </w:rPr>
-        <w:t>library</w:t>
-      </w:r>
-      <w:proofErr w:type="gramEnd"/>
-      <w:r>
-        <w:rPr>
-          <w:rFonts w:ascii="Times New Roman" w:hAnsi="Times New Roman" w:cs="Times New Roman"/>
-          <w:sz w:val="24"/>
-          <w:szCs w:val="24"/>
-        </w:rPr>
-        <w:t>-profile</w:t>
-      </w:r>
-      <w:r>
-        <w:rPr>
-          <w:rFonts w:ascii="Times New Roman" w:hAnsi="Times New Roman" w:cs="Times New Roman"/>
-          <w:sz w:val="24"/>
-          <w:szCs w:val="24"/>
-        </w:rPr>
-        <w:t xml:space="preserve"> /</w:t>
-      </w:r>
-      <w:proofErr w:type="spellStart"/>
-      <w:r>
-        <w:rPr>
-          <w:rFonts w:ascii="Times New Roman" w:hAnsi="Times New Roman" w:cs="Times New Roman"/>
-          <w:sz w:val="24"/>
-          <w:szCs w:val="24"/>
-        </w:rPr>
-        <w:t>profileOverview</w:t>
-      </w:r>
-      <w:proofErr w:type="spellEnd"/>
-      <w:r>
-        <w:rPr>
-          <w:rFonts w:ascii="Times New Roman" w:hAnsi="Times New Roman" w:cs="Times New Roman"/>
-          <w:sz w:val="24"/>
-          <w:szCs w:val="24"/>
-        </w:rPr>
-        <w:t xml:space="preserve"> - </w:t>
-      </w:r>
-      <w:proofErr w:type="spellStart"/>
-      <w:r>
-        <w:rPr>
-          <w:rFonts w:ascii="Times New Roman" w:hAnsi="Times New Roman" w:cs="Times New Roman"/>
-          <w:sz w:val="24"/>
-          <w:szCs w:val="24"/>
-        </w:rPr>
-        <w:t>ProfileOverview</w:t>
-      </w:r>
-      <w:proofErr w:type="spellEnd"/>
+        <w:t>/library-profile /profileOverview - ProfileOverview</w:t>
+      </w:r>
     </w:p>
     <w:p>
       <w:pPr>
@@ -1069,25 +593,7 @@
           <w:sz w:val="24"/>
           <w:szCs w:val="24"/>
         </w:rPr>
-        <w:t xml:space="preserve">Footer – (common footer used in the library home </w:t>
-      </w:r>
-      <w:proofErr w:type="gramStart"/>
-      <w:r>
-        <w:rPr>
-          <w:rFonts w:ascii="Times New Roman" w:hAnsi="Times New Roman" w:cs="Times New Roman"/>
-          <w:sz w:val="24"/>
-          <w:szCs w:val="24"/>
-        </w:rPr>
-        <w:t>page ,</w:t>
-      </w:r>
-      <w:proofErr w:type="gramEnd"/>
-      <w:r>
-        <w:rPr>
-          <w:rFonts w:ascii="Times New Roman" w:hAnsi="Times New Roman" w:cs="Times New Roman"/>
-          <w:sz w:val="24"/>
-          <w:szCs w:val="24"/>
-        </w:rPr>
-        <w:t xml:space="preserve"> book page and contact-us )</w:t>
+        <w:t>Footer – (common footer used in the library home page , book page and contact-us )</w:t>
       </w:r>
     </w:p>
     <w:p>
@@ -1142,16 +648,15 @@
           <w:sz w:val="24"/>
           <w:szCs w:val="24"/>
         </w:rPr>
-        <w:t>/</w:t>
-      </w:r>
-      <w:proofErr w:type="gramStart"/>
-      <w:r>
-        <w:rPr>
-          <w:rFonts w:ascii="Times New Roman" w:hAnsi="Times New Roman" w:cs="Times New Roman"/>
-          <w:sz w:val="24"/>
-          <w:szCs w:val="24"/>
-        </w:rPr>
-        <w:t xml:space="preserve">public </w:t>
+        <w:t xml:space="preserve">Check  </w:t>
+      </w:r>
+      <w:r>
+        <w:rPr>
+          <w:rFonts w:ascii="Times New Roman" w:hAnsi="Times New Roman" w:cs="Times New Roman"/>
+          <w:sz w:val="24"/>
+          <w:szCs w:val="24"/>
+        </w:rPr>
+        <w:t xml:space="preserve">/public </w:t>
       </w:r>
       <w:r>
         <w:rPr>
@@ -1167,50 +672,31 @@
           <w:sz w:val="24"/>
           <w:szCs w:val="24"/>
         </w:rPr>
-        <w:t>except</w:t>
-      </w:r>
-      <w:proofErr w:type="gramEnd"/>
-      <w:r>
-        <w:rPr>
-          <w:rFonts w:ascii="Times New Roman" w:hAnsi="Times New Roman" w:cs="Times New Roman"/>
-          <w:sz w:val="24"/>
-          <w:szCs w:val="24"/>
-        </w:rPr>
-        <w:t xml:space="preserve">   </w:t>
-      </w:r>
-      <w:r>
-        <w:rPr>
-          <w:rFonts w:ascii="Times New Roman" w:hAnsi="Times New Roman" w:cs="Times New Roman"/>
-          <w:sz w:val="24"/>
-          <w:szCs w:val="24"/>
-        </w:rPr>
-        <w:t>(</w:t>
-      </w:r>
-      <w:proofErr w:type="spellStart"/>
-      <w:r>
-        <w:rPr>
-          <w:rFonts w:ascii="Times New Roman" w:hAnsi="Times New Roman" w:cs="Times New Roman"/>
-          <w:sz w:val="24"/>
-          <w:szCs w:val="24"/>
-        </w:rPr>
-        <w:t>MyProfilePage</w:t>
-      </w:r>
-      <w:proofErr w:type="spellEnd"/>
-      <w:r>
-        <w:rPr>
-          <w:rFonts w:ascii="Times New Roman" w:hAnsi="Times New Roman" w:cs="Times New Roman"/>
-          <w:sz w:val="24"/>
-          <w:szCs w:val="24"/>
-        </w:rPr>
-        <w:t xml:space="preserve"> – images within the folder </w:t>
-      </w:r>
-      <w:r>
-        <w:rPr>
-          <w:rFonts w:ascii="Times New Roman" w:hAnsi="Times New Roman" w:cs="Times New Roman"/>
-          <w:sz w:val="24"/>
-          <w:szCs w:val="24"/>
-        </w:rPr>
-        <w:t>)</w:t>
+        <w:t>directory  or  within the folder</w:t>
+      </w:r>
+      <w:r>
+        <w:rPr>
+          <w:rFonts w:ascii="Times New Roman" w:hAnsi="Times New Roman" w:cs="Times New Roman"/>
+          <w:sz w:val="24"/>
+          <w:szCs w:val="24"/>
+        </w:rPr>
+        <w:t xml:space="preserve">  </w:t>
+      </w:r>
+      <w:r>
+        <w:rPr>
+          <w:rFonts w:ascii="Times New Roman" w:hAnsi="Times New Roman" w:cs="Times New Roman"/>
+          <w:sz w:val="24"/>
+          <w:szCs w:val="24"/>
+        </w:rPr>
+        <w:t>(MyProfilePage – images within the folder )</w:t>
+      </w:r>
+      <w:r>
+        <w:rPr>
+          <w:rFonts w:ascii="Times New Roman" w:hAnsi="Times New Roman" w:cs="Times New Roman"/>
+          <w:sz w:val="24"/>
+          <w:szCs w:val="24"/>
+        </w:rPr>
+        <w:t xml:space="preserve"> &amp; (contact-us page – assets within the folder)</w:t>
       </w:r>
     </w:p>
     <w:p>
@@ -1229,7 +715,6 @@
           <w:szCs w:val="44"/>
         </w:rPr>
       </w:pPr>
-      <w:proofErr w:type="spellStart"/>
       <w:r>
         <w:rPr>
           <w:rFonts w:ascii="Times New Roman" w:hAnsi="Times New Roman" w:cs="Times New Roman"/>
@@ -1238,7 +723,6 @@
         </w:rPr>
         <w:t>ZeberBackend</w:t>
       </w:r>
-      <w:proofErr w:type="spellEnd"/>
     </w:p>
     <w:p>
       <w:pPr>
@@ -1253,23 +737,13 @@
           <w:szCs w:val="24"/>
         </w:rPr>
       </w:pPr>
-      <w:proofErr w:type="spellStart"/>
-      <w:r>
-        <w:rPr>
-          <w:rFonts w:ascii="Times New Roman" w:hAnsi="Times New Roman" w:cs="Times New Roman"/>
-          <w:sz w:val="24"/>
-          <w:szCs w:val="24"/>
-        </w:rPr>
-        <w:t>BuySell</w:t>
-      </w:r>
-      <w:proofErr w:type="spellEnd"/>
-      <w:r>
-        <w:rPr>
-          <w:rFonts w:ascii="Times New Roman" w:hAnsi="Times New Roman" w:cs="Times New Roman"/>
-          <w:sz w:val="24"/>
-          <w:szCs w:val="24"/>
-        </w:rPr>
-        <w:t xml:space="preserve"> backend </w:t>
+      <w:r>
+        <w:rPr>
+          <w:rFonts w:ascii="Times New Roman" w:hAnsi="Times New Roman" w:cs="Times New Roman"/>
+          <w:sz w:val="24"/>
+          <w:szCs w:val="24"/>
+        </w:rPr>
+        <w:t xml:space="preserve">BuySell backend </w:t>
       </w:r>
     </w:p>
     <w:p>
@@ -1285,23 +759,13 @@
           <w:szCs w:val="24"/>
         </w:rPr>
       </w:pPr>
-      <w:proofErr w:type="spellStart"/>
-      <w:r>
-        <w:rPr>
-          <w:rFonts w:ascii="Times New Roman" w:hAnsi="Times New Roman" w:cs="Times New Roman"/>
-          <w:sz w:val="24"/>
-          <w:szCs w:val="24"/>
-        </w:rPr>
-        <w:t>UploadBook</w:t>
-      </w:r>
-      <w:proofErr w:type="spellEnd"/>
-      <w:r>
-        <w:rPr>
-          <w:rFonts w:ascii="Times New Roman" w:hAnsi="Times New Roman" w:cs="Times New Roman"/>
-          <w:sz w:val="24"/>
-          <w:szCs w:val="24"/>
-        </w:rPr>
-        <w:t xml:space="preserve"> backend </w:t>
+      <w:r>
+        <w:rPr>
+          <w:rFonts w:ascii="Times New Roman" w:hAnsi="Times New Roman" w:cs="Times New Roman"/>
+          <w:sz w:val="24"/>
+          <w:szCs w:val="24"/>
+        </w:rPr>
+        <w:t xml:space="preserve">UploadBook backend </w:t>
       </w:r>
     </w:p>
     <w:p>
@@ -1317,23 +781,13 @@
           <w:szCs w:val="24"/>
         </w:rPr>
       </w:pPr>
-      <w:proofErr w:type="spellStart"/>
-      <w:r>
-        <w:rPr>
-          <w:rFonts w:ascii="Times New Roman" w:hAnsi="Times New Roman" w:cs="Times New Roman"/>
-          <w:sz w:val="24"/>
-          <w:szCs w:val="24"/>
-        </w:rPr>
-        <w:t>LibraryProfile</w:t>
-      </w:r>
-      <w:proofErr w:type="spellEnd"/>
-      <w:r>
-        <w:rPr>
-          <w:rFonts w:ascii="Times New Roman" w:hAnsi="Times New Roman" w:cs="Times New Roman"/>
-          <w:sz w:val="24"/>
-          <w:szCs w:val="24"/>
-        </w:rPr>
-        <w:t xml:space="preserve"> backend</w:t>
+      <w:r>
+        <w:rPr>
+          <w:rFonts w:ascii="Times New Roman" w:hAnsi="Times New Roman" w:cs="Times New Roman"/>
+          <w:sz w:val="24"/>
+          <w:szCs w:val="24"/>
+        </w:rPr>
+        <w:t>LibraryProfile backend</w:t>
       </w:r>
     </w:p>
     <w:p>

</xml_diff>